<commit_message>
Aggiunta di alcune carte
</commit_message>
<xml_diff>
--- a/Documentazione/Tesi.docx
+++ b/Documentazione/Tesi.docx
@@ -87,12 +87,14 @@
         <w:rPr>
           <w:sz w:val="24"/>
           <w:szCs w:val="24"/>
-        </w:rPr>
-      </w:pPr>
-      <w:r>
-        <w:rPr>
-          <w:sz w:val="24"/>
-          <w:szCs w:val="24"/>
+          <w:highlight w:val="yellow"/>
+        </w:rPr>
+      </w:pPr>
+      <w:r>
+        <w:rPr>
+          <w:sz w:val="24"/>
+          <w:szCs w:val="24"/>
+          <w:highlight w:val="yellow"/>
         </w:rPr>
         <w:t>Riassunto dei capitoli successivi</w:t>
       </w:r>
@@ -248,12 +250,14 @@
         <w:rPr>
           <w:sz w:val="24"/>
           <w:szCs w:val="24"/>
-        </w:rPr>
-      </w:pPr>
-      <w:r>
-        <w:rPr>
-          <w:sz w:val="24"/>
-          <w:szCs w:val="24"/>
+          <w:highlight w:val="yellow"/>
+        </w:rPr>
+      </w:pPr>
+      <w:r>
+        <w:rPr>
+          <w:sz w:val="24"/>
+          <w:szCs w:val="24"/>
+          <w:highlight w:val="yellow"/>
         </w:rPr>
         <w:t>Requisiti Funzionali</w:t>
       </w:r>
@@ -292,6 +296,7 @@
         <w:rPr>
           <w:sz w:val="24"/>
           <w:szCs w:val="24"/>
+          <w:highlight w:val="yellow"/>
         </w:rPr>
       </w:pPr>
       <w:proofErr w:type="spellStart"/>
@@ -299,6 +304,7 @@
         <w:rPr>
           <w:sz w:val="24"/>
           <w:szCs w:val="24"/>
+          <w:highlight w:val="yellow"/>
         </w:rPr>
         <w:t>Modelling</w:t>
       </w:r>
@@ -307,6 +313,7 @@
         <w:rPr>
           <w:sz w:val="24"/>
           <w:szCs w:val="24"/>
+          <w:highlight w:val="yellow"/>
         </w:rPr>
         <w:t xml:space="preserve"> UML</w:t>
       </w:r>
@@ -419,7 +426,7 @@
       <w:pPr>
         <w:pStyle w:val="Paragrafoelenco"/>
         <w:numPr>
-          <w:ilvl w:val="0"/>
+          <w:ilvl w:val="1"/>
           <w:numId w:val="1"/>
         </w:numPr>
         <w:spacing w:line="360" w:lineRule="auto"/>
@@ -434,7 +441,203 @@
           <w:sz w:val="24"/>
           <w:szCs w:val="24"/>
         </w:rPr>
-        <w:t>Software testing</w:t>
+        <w:t>Home page o pagina “esplora” (index)</w:t>
+      </w:r>
+    </w:p>
+    <w:p>
+      <w:pPr>
+        <w:pStyle w:val="Paragrafoelenco"/>
+        <w:numPr>
+          <w:ilvl w:val="1"/>
+          <w:numId w:val="1"/>
+        </w:numPr>
+        <w:spacing w:line="360" w:lineRule="auto"/>
+        <w:jc w:val="both"/>
+        <w:rPr>
+          <w:sz w:val="24"/>
+          <w:szCs w:val="24"/>
+        </w:rPr>
+      </w:pPr>
+      <w:r>
+        <w:rPr>
+          <w:sz w:val="24"/>
+          <w:szCs w:val="24"/>
+        </w:rPr>
+        <w:t>Registrazione (</w:t>
+      </w:r>
+      <w:proofErr w:type="spellStart"/>
+      <w:r>
+        <w:rPr>
+          <w:sz w:val="24"/>
+          <w:szCs w:val="24"/>
+        </w:rPr>
+        <w:t>signup</w:t>
+      </w:r>
+      <w:proofErr w:type="spellEnd"/>
+      <w:r>
+        <w:rPr>
+          <w:sz w:val="24"/>
+          <w:szCs w:val="24"/>
+        </w:rPr>
+        <w:t>)</w:t>
+      </w:r>
+    </w:p>
+    <w:p>
+      <w:pPr>
+        <w:pStyle w:val="Paragrafoelenco"/>
+        <w:numPr>
+          <w:ilvl w:val="1"/>
+          <w:numId w:val="1"/>
+        </w:numPr>
+        <w:spacing w:line="360" w:lineRule="auto"/>
+        <w:jc w:val="both"/>
+        <w:rPr>
+          <w:sz w:val="24"/>
+          <w:szCs w:val="24"/>
+        </w:rPr>
+      </w:pPr>
+      <w:r>
+        <w:rPr>
+          <w:sz w:val="24"/>
+          <w:szCs w:val="24"/>
+        </w:rPr>
+        <w:t>Accesso (login)</w:t>
+      </w:r>
+    </w:p>
+    <w:p>
+      <w:pPr>
+        <w:pStyle w:val="Paragrafoelenco"/>
+        <w:numPr>
+          <w:ilvl w:val="1"/>
+          <w:numId w:val="1"/>
+        </w:numPr>
+        <w:spacing w:line="360" w:lineRule="auto"/>
+        <w:jc w:val="both"/>
+        <w:rPr>
+          <w:sz w:val="24"/>
+          <w:szCs w:val="24"/>
+        </w:rPr>
+      </w:pPr>
+      <w:r>
+        <w:rPr>
+          <w:sz w:val="24"/>
+          <w:szCs w:val="24"/>
+        </w:rPr>
+        <w:t>Impostazioni dell’account (settings)</w:t>
+      </w:r>
+    </w:p>
+    <w:p>
+      <w:pPr>
+        <w:pStyle w:val="Paragrafoelenco"/>
+        <w:numPr>
+          <w:ilvl w:val="1"/>
+          <w:numId w:val="1"/>
+        </w:numPr>
+        <w:spacing w:line="360" w:lineRule="auto"/>
+        <w:jc w:val="both"/>
+        <w:rPr>
+          <w:sz w:val="24"/>
+          <w:szCs w:val="24"/>
+        </w:rPr>
+      </w:pPr>
+      <w:r>
+        <w:rPr>
+          <w:sz w:val="24"/>
+          <w:szCs w:val="24"/>
+        </w:rPr>
+        <w:t>Seguiti (</w:t>
+      </w:r>
+      <w:proofErr w:type="spellStart"/>
+      <w:r>
+        <w:rPr>
+          <w:sz w:val="24"/>
+          <w:szCs w:val="24"/>
+        </w:rPr>
+        <w:t>perTe</w:t>
+      </w:r>
+      <w:proofErr w:type="spellEnd"/>
+      <w:r>
+        <w:rPr>
+          <w:sz w:val="24"/>
+          <w:szCs w:val="24"/>
+        </w:rPr>
+        <w:t>)</w:t>
+      </w:r>
+    </w:p>
+    <w:p>
+      <w:pPr>
+        <w:pStyle w:val="Paragrafoelenco"/>
+        <w:numPr>
+          <w:ilvl w:val="1"/>
+          <w:numId w:val="1"/>
+        </w:numPr>
+        <w:spacing w:line="360" w:lineRule="auto"/>
+        <w:jc w:val="both"/>
+        <w:rPr>
+          <w:sz w:val="24"/>
+          <w:szCs w:val="24"/>
+        </w:rPr>
+      </w:pPr>
+      <w:r>
+        <w:rPr>
+          <w:sz w:val="24"/>
+          <w:szCs w:val="24"/>
+        </w:rPr>
+        <w:t>Profilo dell’utente (</w:t>
+      </w:r>
+      <w:proofErr w:type="spellStart"/>
+      <w:r>
+        <w:rPr>
+          <w:sz w:val="24"/>
+          <w:szCs w:val="24"/>
+        </w:rPr>
+        <w:t>profile</w:t>
+      </w:r>
+      <w:proofErr w:type="spellEnd"/>
+      <w:r>
+        <w:rPr>
+          <w:sz w:val="24"/>
+          <w:szCs w:val="24"/>
+        </w:rPr>
+        <w:t>)</w:t>
+      </w:r>
+    </w:p>
+    <w:p>
+      <w:pPr>
+        <w:pStyle w:val="Paragrafoelenco"/>
+        <w:numPr>
+          <w:ilvl w:val="1"/>
+          <w:numId w:val="1"/>
+        </w:numPr>
+        <w:spacing w:line="360" w:lineRule="auto"/>
+        <w:jc w:val="both"/>
+        <w:rPr>
+          <w:sz w:val="24"/>
+          <w:szCs w:val="24"/>
+        </w:rPr>
+      </w:pPr>
+      <w:r>
+        <w:rPr>
+          <w:sz w:val="24"/>
+          <w:szCs w:val="24"/>
+        </w:rPr>
+        <w:t xml:space="preserve">Pagine di creazione e modifica del post (create e </w:t>
+      </w:r>
+      <w:proofErr w:type="spellStart"/>
+      <w:r>
+        <w:rPr>
+          <w:sz w:val="24"/>
+          <w:szCs w:val="24"/>
+        </w:rPr>
+        <w:t>edit</w:t>
+      </w:r>
+      <w:proofErr w:type="spellEnd"/>
+      <w:r>
+        <w:rPr>
+          <w:sz w:val="24"/>
+          <w:szCs w:val="24"/>
+        </w:rPr>
+        <w:t>)</w:t>
       </w:r>
     </w:p>
     <w:p>
@@ -449,24 +652,17 @@
         <w:rPr>
           <w:sz w:val="24"/>
           <w:szCs w:val="24"/>
-        </w:rPr>
-      </w:pPr>
-      <w:r>
-        <w:rPr>
-          <w:sz w:val="24"/>
-          <w:szCs w:val="24"/>
-        </w:rPr>
-        <w:t xml:space="preserve">Software </w:t>
-      </w:r>
-      <w:proofErr w:type="spellStart"/>
-      <w:r>
-        <w:rPr>
-          <w:sz w:val="24"/>
-          <w:szCs w:val="24"/>
-        </w:rPr>
-        <w:t>Maintenence</w:t>
-      </w:r>
-      <w:proofErr w:type="spellEnd"/>
+          <w:highlight w:val="yellow"/>
+        </w:rPr>
+      </w:pPr>
+      <w:r>
+        <w:rPr>
+          <w:sz w:val="24"/>
+          <w:szCs w:val="24"/>
+          <w:highlight w:val="yellow"/>
+        </w:rPr>
+        <w:t>Software testing</w:t>
+      </w:r>
     </w:p>
     <w:p>
       <w:pPr>
@@ -480,12 +676,48 @@
         <w:rPr>
           <w:sz w:val="24"/>
           <w:szCs w:val="24"/>
-        </w:rPr>
-      </w:pPr>
-      <w:r>
-        <w:rPr>
-          <w:sz w:val="24"/>
-          <w:szCs w:val="24"/>
+          <w:highlight w:val="yellow"/>
+        </w:rPr>
+      </w:pPr>
+      <w:r>
+        <w:rPr>
+          <w:sz w:val="24"/>
+          <w:szCs w:val="24"/>
+          <w:highlight w:val="yellow"/>
+        </w:rPr>
+        <w:t xml:space="preserve">Software </w:t>
+      </w:r>
+      <w:proofErr w:type="spellStart"/>
+      <w:r>
+        <w:rPr>
+          <w:sz w:val="24"/>
+          <w:szCs w:val="24"/>
+          <w:highlight w:val="yellow"/>
+        </w:rPr>
+        <w:t>Maintenence</w:t>
+      </w:r>
+      <w:proofErr w:type="spellEnd"/>
+    </w:p>
+    <w:p>
+      <w:pPr>
+        <w:pStyle w:val="Paragrafoelenco"/>
+        <w:numPr>
+          <w:ilvl w:val="0"/>
+          <w:numId w:val="1"/>
+        </w:numPr>
+        <w:spacing w:line="360" w:lineRule="auto"/>
+        <w:jc w:val="both"/>
+        <w:rPr>
+          <w:sz w:val="24"/>
+          <w:szCs w:val="24"/>
+          <w:highlight w:val="yellow"/>
+        </w:rPr>
+      </w:pPr>
+      <w:r>
+        <w:rPr>
+          <w:sz w:val="24"/>
+          <w:szCs w:val="24"/>
+          <w:highlight w:val="yellow"/>
         </w:rPr>
         <w:t>Sviluppi futuri</w:t>
       </w:r>
@@ -994,15 +1226,7 @@
           <w:sz w:val="24"/>
           <w:szCs w:val="24"/>
         </w:rPr>
-        <w:t xml:space="preserve"> da qualsiasi dispositivo con accesso a rete internet, sia </w:t>
-      </w:r>
-      <w:r>
-        <w:rPr>
-          <w:sz w:val="24"/>
-          <w:szCs w:val="24"/>
-        </w:rPr>
-        <w:lastRenderedPageBreak/>
-        <w:t xml:space="preserve">desktop che mobile, e può essere esplorato anche senza aver effettuato l’accesso. </w:t>
+        <w:t xml:space="preserve"> da qualsiasi dispositivo con accesso a rete internet, sia desktop che mobile, e può essere esplorato anche senza aver effettuato l’accesso. </w:t>
       </w:r>
       <w:r>
         <w:rPr>
@@ -1306,6 +1530,7 @@
           <w:szCs w:val="24"/>
           <w:highlight w:val="yellow"/>
         </w:rPr>
+        <w:lastRenderedPageBreak/>
         <w:t xml:space="preserve">In informatica il Rapid Application </w:t>
       </w:r>
       <w:proofErr w:type="spellStart"/>
@@ -1384,7 +1609,6 @@
           <w:sz w:val="24"/>
           <w:szCs w:val="24"/>
         </w:rPr>
-        <w:lastRenderedPageBreak/>
         <w:t xml:space="preserve">Nello sviluppo della </w:t>
       </w:r>
       <w:r>
@@ -1870,6 +2094,7 @@
           <w:sz w:val="24"/>
           <w:szCs w:val="24"/>
         </w:rPr>
+        <w:lastRenderedPageBreak/>
         <w:t xml:space="preserve">Il </w:t>
       </w:r>
       <w:r>
@@ -1955,7 +2180,6 @@
           <w:sz w:val="24"/>
           <w:szCs w:val="24"/>
         </w:rPr>
-        <w:lastRenderedPageBreak/>
         <w:t xml:space="preserve">Un tool di GitHub che mi è risultato utile per organizzare il lavoro e tenere traccia dei progressi è stata la </w:t>
       </w:r>
       <w:proofErr w:type="spellStart"/>
@@ -2432,6 +2656,7 @@
           <w:sz w:val="24"/>
           <w:szCs w:val="24"/>
         </w:rPr>
+        <w:lastRenderedPageBreak/>
         <w:t xml:space="preserve">Durante la creazione della Web App ho cercato di seguire i fattori di qualità </w:t>
       </w:r>
       <w:r>
@@ -2484,7 +2709,6 @@
           <w:sz w:val="24"/>
           <w:szCs w:val="24"/>
         </w:rPr>
-        <w:lastRenderedPageBreak/>
         <w:t xml:space="preserve">Attributi legati al funzionamento del prodotto che valutano il comportamento del software:  </w:t>
       </w:r>
     </w:p>
@@ -2972,7 +3196,15 @@
           <w:sz w:val="24"/>
           <w:szCs w:val="24"/>
         </w:rPr>
-        <w:t>Un’attenzione particolare è stata posta all’esperienza d’uso, infatti la Web App prevede diversi messaggi di errore personalizzati che hanno lo scopo di aiutare l’utente durante tutte le operazioni.</w:t>
+        <w:t xml:space="preserve">Un’attenzione particolare è stata posta all’esperienza d’uso, </w:t>
+      </w:r>
+      <w:r>
+        <w:rPr>
+          <w:sz w:val="24"/>
+          <w:szCs w:val="24"/>
+        </w:rPr>
+        <w:lastRenderedPageBreak/>
+        <w:t>infatti la Web App prevede diversi messaggi di errore personalizzati che hanno lo scopo di aiutare l’utente durante tutte le operazioni.</w:t>
       </w:r>
     </w:p>
     <w:p>
@@ -3019,7 +3251,6 @@
           <w:sz w:val="24"/>
           <w:szCs w:val="24"/>
         </w:rPr>
-        <w:lastRenderedPageBreak/>
         <w:t>Manutenibilità:</w:t>
       </w:r>
       <w:r>
@@ -3381,7 +3612,6 @@
           <w:sz w:val="24"/>
           <w:szCs w:val="24"/>
         </w:rPr>
-        <w:lastRenderedPageBreak/>
         <w:t>Durante lo sviluppo del s</w:t>
       </w:r>
       <w:r>
@@ -3877,6 +4107,7 @@
                 <w:sz w:val="24"/>
                 <w:szCs w:val="24"/>
               </w:rPr>
+              <w:lastRenderedPageBreak/>
               <w:t>Caratteristiche principali del post (</w:t>
             </w:r>
             <w:r>
@@ -3905,15 +4136,7 @@
                 <w:sz w:val="24"/>
                 <w:szCs w:val="24"/>
               </w:rPr>
-              <w:t xml:space="preserve">, titolo, data di </w:t>
-            </w:r>
-            <w:r>
-              <w:rPr>
-                <w:sz w:val="24"/>
-                <w:szCs w:val="24"/>
-              </w:rPr>
-              <w:lastRenderedPageBreak/>
-              <w:t>pubblicazione e utente proprietario della carta).</w:t>
+              <w:t>, titolo, data di pubblicazione e utente proprietario della carta).</w:t>
             </w:r>
           </w:p>
         </w:tc>
@@ -4028,6 +4251,7 @@
                 <w:sz w:val="24"/>
                 <w:szCs w:val="24"/>
               </w:rPr>
+              <w:lastRenderedPageBreak/>
               <w:t>Altre caratteristiche del post (descrizione e condizioni della carta)</w:t>
             </w:r>
             <w:r>
@@ -4061,7 +4285,6 @@
                 <w:sz w:val="24"/>
                 <w:szCs w:val="24"/>
               </w:rPr>
-              <w:lastRenderedPageBreak/>
               <w:t>Link alla pagina dove è messa in vendita</w:t>
             </w:r>
             <w:r>
@@ -4770,6 +4993,7 @@
           <w:sz w:val="28"/>
           <w:szCs w:val="28"/>
         </w:rPr>
+        <w:lastRenderedPageBreak/>
         <w:t>Accesso (Login):</w:t>
       </w:r>
     </w:p>
@@ -4812,7 +5036,6 @@
           <w:sz w:val="28"/>
           <w:szCs w:val="28"/>
         </w:rPr>
-        <w:lastRenderedPageBreak/>
         <w:t>Pagina Seguiti</w:t>
       </w:r>
     </w:p>
@@ -5087,6 +5310,7 @@
           <w:sz w:val="32"/>
           <w:szCs w:val="32"/>
         </w:rPr>
+        <w:lastRenderedPageBreak/>
         <w:t>7.1 Tecnologie utilizzate</w:t>
       </w:r>
     </w:p>
@@ -5104,7 +5328,6 @@
           <w:sz w:val="24"/>
           <w:szCs w:val="24"/>
         </w:rPr>
-        <w:lastRenderedPageBreak/>
         <w:t xml:space="preserve">Nel seguente capitolo sono elencate e descritte le tecnologie utilizzate nella creazione di </w:t>
       </w:r>
       <w:proofErr w:type="spellStart"/>
@@ -5511,6 +5734,7 @@
           <w:szCs w:val="24"/>
           <w:highlight w:val="yellow"/>
         </w:rPr>
+        <w:lastRenderedPageBreak/>
         <w:t>Python è un linguaggio di programmazione dinamico orientato agli oggetti utilizzabile per molti tipi di sviluppo software (PYTHON).</w:t>
       </w:r>
       <w:r>
@@ -5539,7 +5763,6 @@
           <w:sz w:val="28"/>
           <w:szCs w:val="28"/>
         </w:rPr>
-        <w:lastRenderedPageBreak/>
         <w:t>Django</w:t>
       </w:r>
     </w:p>
@@ -5739,6 +5962,7 @@
           <w:sz w:val="24"/>
           <w:szCs w:val="24"/>
         </w:rPr>
+        <w:lastRenderedPageBreak/>
         <w:drawing>
           <wp:inline distT="0" distB="0" distL="0" distR="0" wp14:anchorId="051649A5" wp14:editId="366FF7D0">
             <wp:extent cx="5400040" cy="2505710"/>
@@ -5854,7 +6078,6 @@
           <w:sz w:val="24"/>
           <w:szCs w:val="24"/>
         </w:rPr>
-        <w:lastRenderedPageBreak/>
         <w:t>Ecco lo schema logico del database:</w:t>
       </w:r>
     </w:p>
@@ -6178,182 +6401,6 @@
         </w:rPr>
         <w:t>)</w:t>
       </w:r>
-    </w:p>
-    <w:p>
-      <w:pPr>
-        <w:spacing w:line="360" w:lineRule="auto"/>
-        <w:jc w:val="both"/>
-        <w:rPr>
-          <w:sz w:val="24"/>
-          <w:szCs w:val="24"/>
-          <w:lang w:val="en-GB"/>
-        </w:rPr>
-      </w:pPr>
-    </w:p>
-    <w:p>
-      <w:pPr>
-        <w:spacing w:line="360" w:lineRule="auto"/>
-        <w:jc w:val="both"/>
-        <w:rPr>
-          <w:sz w:val="24"/>
-          <w:szCs w:val="24"/>
-          <w:lang w:val="en-GB"/>
-        </w:rPr>
-      </w:pPr>
-    </w:p>
-    <w:p>
-      <w:pPr>
-        <w:spacing w:line="360" w:lineRule="auto"/>
-        <w:jc w:val="both"/>
-        <w:rPr>
-          <w:sz w:val="24"/>
-          <w:szCs w:val="24"/>
-          <w:lang w:val="en-GB"/>
-        </w:rPr>
-      </w:pPr>
-    </w:p>
-    <w:p>
-      <w:pPr>
-        <w:spacing w:line="360" w:lineRule="auto"/>
-        <w:jc w:val="both"/>
-        <w:rPr>
-          <w:sz w:val="24"/>
-          <w:szCs w:val="24"/>
-          <w:lang w:val="en-GB"/>
-        </w:rPr>
-      </w:pPr>
-    </w:p>
-    <w:p>
-      <w:pPr>
-        <w:spacing w:line="360" w:lineRule="auto"/>
-        <w:jc w:val="both"/>
-        <w:rPr>
-          <w:sz w:val="24"/>
-          <w:szCs w:val="24"/>
-          <w:lang w:val="en-GB"/>
-        </w:rPr>
-      </w:pPr>
-    </w:p>
-    <w:p>
-      <w:pPr>
-        <w:spacing w:line="360" w:lineRule="auto"/>
-        <w:jc w:val="both"/>
-        <w:rPr>
-          <w:sz w:val="24"/>
-          <w:szCs w:val="24"/>
-          <w:lang w:val="en-GB"/>
-        </w:rPr>
-      </w:pPr>
-    </w:p>
-    <w:p>
-      <w:pPr>
-        <w:spacing w:line="360" w:lineRule="auto"/>
-        <w:jc w:val="both"/>
-        <w:rPr>
-          <w:sz w:val="24"/>
-          <w:szCs w:val="24"/>
-          <w:lang w:val="en-GB"/>
-        </w:rPr>
-      </w:pPr>
-    </w:p>
-    <w:p>
-      <w:pPr>
-        <w:spacing w:line="360" w:lineRule="auto"/>
-        <w:jc w:val="both"/>
-        <w:rPr>
-          <w:sz w:val="24"/>
-          <w:szCs w:val="24"/>
-          <w:lang w:val="en-GB"/>
-        </w:rPr>
-      </w:pPr>
-    </w:p>
-    <w:p>
-      <w:pPr>
-        <w:spacing w:line="360" w:lineRule="auto"/>
-        <w:jc w:val="both"/>
-        <w:rPr>
-          <w:sz w:val="24"/>
-          <w:szCs w:val="24"/>
-          <w:lang w:val="en-GB"/>
-        </w:rPr>
-      </w:pPr>
-    </w:p>
-    <w:p>
-      <w:pPr>
-        <w:spacing w:line="360" w:lineRule="auto"/>
-        <w:jc w:val="both"/>
-        <w:rPr>
-          <w:sz w:val="24"/>
-          <w:szCs w:val="24"/>
-          <w:lang w:val="en-GB"/>
-        </w:rPr>
-      </w:pPr>
-    </w:p>
-    <w:p>
-      <w:pPr>
-        <w:spacing w:line="360" w:lineRule="auto"/>
-        <w:jc w:val="both"/>
-        <w:rPr>
-          <w:sz w:val="24"/>
-          <w:szCs w:val="24"/>
-          <w:lang w:val="en-GB"/>
-        </w:rPr>
-      </w:pPr>
-    </w:p>
-    <w:p>
-      <w:pPr>
-        <w:spacing w:line="360" w:lineRule="auto"/>
-        <w:jc w:val="both"/>
-        <w:rPr>
-          <w:sz w:val="24"/>
-          <w:szCs w:val="24"/>
-          <w:lang w:val="en-GB"/>
-        </w:rPr>
-      </w:pPr>
-    </w:p>
-    <w:p>
-      <w:pPr>
-        <w:spacing w:line="360" w:lineRule="auto"/>
-        <w:jc w:val="both"/>
-        <w:rPr>
-          <w:sz w:val="24"/>
-          <w:szCs w:val="24"/>
-          <w:lang w:val="en-GB"/>
-        </w:rPr>
-      </w:pPr>
-    </w:p>
-    <w:p>
-      <w:pPr>
-        <w:spacing w:line="360" w:lineRule="auto"/>
-        <w:jc w:val="both"/>
-        <w:rPr>
-          <w:sz w:val="24"/>
-          <w:szCs w:val="24"/>
-          <w:lang w:val="en-GB"/>
-        </w:rPr>
-      </w:pPr>
-    </w:p>
-    <w:p>
-      <w:pPr>
-        <w:spacing w:line="360" w:lineRule="auto"/>
-        <w:jc w:val="both"/>
-        <w:rPr>
-          <w:sz w:val="24"/>
-          <w:szCs w:val="24"/>
-          <w:lang w:val="en-GB"/>
-        </w:rPr>
-      </w:pPr>
-    </w:p>
-    <w:p>
-      <w:pPr>
-        <w:spacing w:line="360" w:lineRule="auto"/>
-        <w:jc w:val="both"/>
-        <w:rPr>
-          <w:sz w:val="24"/>
-          <w:szCs w:val="24"/>
-          <w:lang w:val="en-GB"/>
-        </w:rPr>
-      </w:pPr>
     </w:p>
     <w:p>
       <w:pPr>
@@ -6376,24 +6423,21 @@
           <w:szCs w:val="40"/>
         </w:rPr>
       </w:pPr>
-      <w:proofErr w:type="spellStart"/>
       <w:r>
         <w:rPr>
           <w:rStyle w:val="Enfasigrassetto"/>
           <w:sz w:val="40"/>
           <w:szCs w:val="40"/>
         </w:rPr>
-        <w:lastRenderedPageBreak/>
-        <w:t>Capitolo</w:t>
-      </w:r>
-      <w:proofErr w:type="spellEnd"/>
+        <w:t>Capitolo 8:</w:t>
+      </w:r>
       <w:r>
         <w:rPr>
           <w:rStyle w:val="Enfasigrassetto"/>
           <w:sz w:val="40"/>
           <w:szCs w:val="40"/>
         </w:rPr>
-        <w:t xml:space="preserve"> 8:</w:t>
+        <w:tab/>
       </w:r>
       <w:r>
         <w:rPr>
@@ -6401,23 +6445,15 @@
           <w:sz w:val="40"/>
           <w:szCs w:val="40"/>
         </w:rPr>
-        <w:tab/>
-      </w:r>
+        <w:t xml:space="preserve">Software </w:t>
+      </w:r>
+      <w:proofErr w:type="spellStart"/>
       <w:r>
         <w:rPr>
           <w:rStyle w:val="Enfasigrassetto"/>
           <w:sz w:val="40"/>
           <w:szCs w:val="40"/>
         </w:rPr>
-        <w:t xml:space="preserve">Software </w:t>
-      </w:r>
-      <w:proofErr w:type="spellStart"/>
-      <w:r>
-        <w:rPr>
-          <w:rStyle w:val="Enfasigrassetto"/>
-          <w:sz w:val="40"/>
-          <w:szCs w:val="40"/>
-        </w:rPr>
         <w:t>developement</w:t>
       </w:r>
       <w:proofErr w:type="spellEnd"/>
@@ -6438,54 +6474,26 @@
           <w:sz w:val="32"/>
           <w:szCs w:val="32"/>
         </w:rPr>
-        <w:t>8.1 Home page</w:t>
-      </w:r>
+        <w:t xml:space="preserve">8.1 </w:t>
+      </w:r>
+      <w:bookmarkStart w:id="0" w:name="_Hlk201172815"/>
       <w:r>
         <w:rPr>
           <w:rStyle w:val="Enfasigrassetto"/>
           <w:sz w:val="32"/>
           <w:szCs w:val="32"/>
         </w:rPr>
-        <w:t xml:space="preserve"> o pagina “esplora” (index)</w:t>
-      </w:r>
-    </w:p>
-    <w:p>
-      <w:pPr>
-        <w:spacing w:line="360" w:lineRule="auto"/>
-        <w:jc w:val="both"/>
-        <w:rPr>
-          <w:sz w:val="24"/>
-          <w:szCs w:val="24"/>
-        </w:rPr>
-      </w:pPr>
-      <w:r>
-        <w:rPr>
-          <w:sz w:val="24"/>
-          <w:szCs w:val="24"/>
-        </w:rPr>
-        <w:t xml:space="preserve">Rappresenta la pagina principale del sito, accessibile anche per i visitatori che non hanno effettuato l’autentificazione. Grazie alla funzione di ordinamento, l’utente può visualizzare i post più recenti, quelli con un numero maggiore di like, oppure quelli più presenti nelle wishlist degli utenti. È presenta una barra di ricerca che consente di filtrare dinamicamente i contenuti in base all’input fornito, effettuando il confronto sia tra i nomi utenti che tra i titoli dei post. </w:t>
-      </w:r>
-    </w:p>
-    <w:p>
-      <w:pPr>
-        <w:spacing w:line="360" w:lineRule="auto"/>
-        <w:jc w:val="both"/>
-        <w:rPr>
-          <w:sz w:val="24"/>
-          <w:szCs w:val="24"/>
-        </w:rPr>
-      </w:pPr>
-    </w:p>
-    <w:p>
-      <w:pPr>
-        <w:spacing w:line="360" w:lineRule="auto"/>
-        <w:jc w:val="both"/>
+        <w:t>Home page</w:t>
+      </w:r>
+      <w:r>
         <w:rPr>
           <w:rStyle w:val="Enfasigrassetto"/>
           <w:sz w:val="32"/>
           <w:szCs w:val="32"/>
         </w:rPr>
-      </w:pPr>
+        <w:t xml:space="preserve"> o pagina “esplora” (index)</w:t>
+      </w:r>
+      <w:bookmarkEnd w:id="0"/>
     </w:p>
     <w:p>
       <w:pPr>
@@ -6497,6 +6505,21 @@
           <w:szCs w:val="32"/>
         </w:rPr>
       </w:pPr>
+      <w:r>
+        <w:rPr>
+          <w:sz w:val="24"/>
+          <w:szCs w:val="24"/>
+        </w:rPr>
+        <w:t xml:space="preserve">Rappresenta la pagina principale del sito, accessibile anche per i visitatori che non hanno effettuato l’autentificazione. Grazie alla funzione di ordinamento, l’utente può visualizzare i post più recenti, quelli con un numero maggiore di like, oppure quelli più presenti nelle wishlist degli utenti. È presenta una barra di ricerca che </w:t>
+      </w:r>
+      <w:r>
+        <w:rPr>
+          <w:sz w:val="24"/>
+          <w:szCs w:val="24"/>
+        </w:rPr>
+        <w:lastRenderedPageBreak/>
+        <w:t xml:space="preserve">consente di filtrare dinamicamente i contenuti in base all’input fornito, effettuando il confronto sia tra i nomi utenti che tra i titoli dei post. </w:t>
+      </w:r>
     </w:p>
     <w:p>
       <w:pPr>
@@ -6508,112 +6531,12 @@
           <w:szCs w:val="32"/>
         </w:rPr>
       </w:pPr>
-    </w:p>
-    <w:p>
-      <w:pPr>
-        <w:spacing w:line="360" w:lineRule="auto"/>
-        <w:jc w:val="both"/>
+      <w:r>
         <w:rPr>
           <w:rStyle w:val="Enfasigrassetto"/>
           <w:sz w:val="32"/>
           <w:szCs w:val="32"/>
         </w:rPr>
-      </w:pPr>
-    </w:p>
-    <w:p>
-      <w:pPr>
-        <w:spacing w:line="360" w:lineRule="auto"/>
-        <w:jc w:val="both"/>
-        <w:rPr>
-          <w:rStyle w:val="Enfasigrassetto"/>
-          <w:sz w:val="32"/>
-          <w:szCs w:val="32"/>
-        </w:rPr>
-      </w:pPr>
-    </w:p>
-    <w:p>
-      <w:pPr>
-        <w:spacing w:line="360" w:lineRule="auto"/>
-        <w:jc w:val="both"/>
-        <w:rPr>
-          <w:rStyle w:val="Enfasigrassetto"/>
-          <w:sz w:val="32"/>
-          <w:szCs w:val="32"/>
-        </w:rPr>
-      </w:pPr>
-    </w:p>
-    <w:p>
-      <w:pPr>
-        <w:spacing w:line="360" w:lineRule="auto"/>
-        <w:jc w:val="both"/>
-        <w:rPr>
-          <w:rStyle w:val="Enfasigrassetto"/>
-          <w:sz w:val="32"/>
-          <w:szCs w:val="32"/>
-        </w:rPr>
-      </w:pPr>
-    </w:p>
-    <w:p>
-      <w:pPr>
-        <w:spacing w:line="360" w:lineRule="auto"/>
-        <w:jc w:val="both"/>
-        <w:rPr>
-          <w:rStyle w:val="Enfasigrassetto"/>
-          <w:sz w:val="32"/>
-          <w:szCs w:val="32"/>
-        </w:rPr>
-      </w:pPr>
-    </w:p>
-    <w:p>
-      <w:pPr>
-        <w:spacing w:line="360" w:lineRule="auto"/>
-        <w:jc w:val="both"/>
-        <w:rPr>
-          <w:rStyle w:val="Enfasigrassetto"/>
-          <w:sz w:val="32"/>
-          <w:szCs w:val="32"/>
-        </w:rPr>
-      </w:pPr>
-    </w:p>
-    <w:p>
-      <w:pPr>
-        <w:spacing w:line="360" w:lineRule="auto"/>
-        <w:jc w:val="both"/>
-        <w:rPr>
-          <w:rStyle w:val="Enfasigrassetto"/>
-          <w:sz w:val="32"/>
-          <w:szCs w:val="32"/>
-        </w:rPr>
-      </w:pPr>
-    </w:p>
-    <w:p>
-      <w:pPr>
-        <w:spacing w:line="360" w:lineRule="auto"/>
-        <w:jc w:val="both"/>
-        <w:rPr>
-          <w:rStyle w:val="Enfasigrassetto"/>
-          <w:sz w:val="32"/>
-          <w:szCs w:val="32"/>
-        </w:rPr>
-      </w:pPr>
-    </w:p>
-    <w:p>
-      <w:pPr>
-        <w:spacing w:line="360" w:lineRule="auto"/>
-        <w:jc w:val="both"/>
-        <w:rPr>
-          <w:rStyle w:val="Enfasigrassetto"/>
-          <w:sz w:val="32"/>
-          <w:szCs w:val="32"/>
-        </w:rPr>
-      </w:pPr>
-      <w:r>
-        <w:rPr>
-          <w:rStyle w:val="Enfasigrassetto"/>
-          <w:sz w:val="32"/>
-          <w:szCs w:val="32"/>
-        </w:rPr>
-        <w:lastRenderedPageBreak/>
         <w:t>8.2 Registrazione (</w:t>
       </w:r>
       <w:proofErr w:type="spellStart"/>
@@ -6784,6 +6707,7 @@
       </w:pPr>
       <w:r>
         <w:rPr>
+          <w:noProof/>
           <w:sz w:val="24"/>
           <w:szCs w:val="24"/>
         </w:rPr>
@@ -6829,92 +6753,57 @@
         <w:spacing w:line="360" w:lineRule="auto"/>
         <w:jc w:val="both"/>
         <w:rPr>
-          <w:sz w:val="24"/>
-          <w:szCs w:val="24"/>
-        </w:rPr>
-      </w:pPr>
-    </w:p>
-    <w:p>
-      <w:pPr>
-        <w:spacing w:line="360" w:lineRule="auto"/>
-        <w:jc w:val="both"/>
-        <w:rPr>
           <w:rStyle w:val="Enfasigrassetto"/>
           <w:sz w:val="32"/>
           <w:szCs w:val="32"/>
         </w:rPr>
       </w:pPr>
-    </w:p>
-    <w:p>
-      <w:pPr>
-        <w:spacing w:line="360" w:lineRule="auto"/>
-        <w:jc w:val="both"/>
+      <w:r>
         <w:rPr>
           <w:rStyle w:val="Enfasigrassetto"/>
           <w:sz w:val="32"/>
           <w:szCs w:val="32"/>
         </w:rPr>
-      </w:pPr>
-    </w:p>
-    <w:p>
-      <w:pPr>
-        <w:spacing w:line="360" w:lineRule="auto"/>
-        <w:jc w:val="both"/>
-        <w:rPr>
-          <w:rStyle w:val="Enfasigrassetto"/>
-          <w:sz w:val="32"/>
-          <w:szCs w:val="32"/>
-        </w:rPr>
-      </w:pPr>
-    </w:p>
-    <w:p>
-      <w:pPr>
-        <w:spacing w:line="360" w:lineRule="auto"/>
-        <w:jc w:val="both"/>
-        <w:rPr>
-          <w:rStyle w:val="Enfasigrassetto"/>
-          <w:sz w:val="32"/>
-          <w:szCs w:val="32"/>
-        </w:rPr>
-      </w:pPr>
-      <w:r>
-        <w:rPr>
-          <w:rStyle w:val="Enfasigrassetto"/>
-          <w:sz w:val="32"/>
-          <w:szCs w:val="32"/>
+        <w:t>8.3 Accesso (login)</w:t>
+      </w:r>
+    </w:p>
+    <w:p>
+      <w:pPr>
+        <w:spacing w:line="360" w:lineRule="auto"/>
+        <w:jc w:val="both"/>
+        <w:rPr>
+          <w:sz w:val="24"/>
+          <w:szCs w:val="24"/>
+        </w:rPr>
+      </w:pPr>
+      <w:r>
+        <w:rPr>
+          <w:sz w:val="24"/>
+          <w:szCs w:val="24"/>
+        </w:rPr>
+        <w:t xml:space="preserve">La pagina di login permette all’utente già registrato di effettuare l’accesso al proprio account personale. Vengono mostrati i campi per l’inserimento di e-mail (o nome </w:t>
+      </w:r>
+      <w:r>
+        <w:rPr>
+          <w:sz w:val="24"/>
+          <w:szCs w:val="24"/>
         </w:rPr>
         <w:lastRenderedPageBreak/>
-        <w:t>8.3 Accesso (login)</w:t>
-      </w:r>
-    </w:p>
-    <w:p>
-      <w:pPr>
-        <w:spacing w:line="360" w:lineRule="auto"/>
-        <w:jc w:val="both"/>
-        <w:rPr>
-          <w:sz w:val="24"/>
-          <w:szCs w:val="24"/>
-        </w:rPr>
-      </w:pPr>
-      <w:r>
-        <w:rPr>
-          <w:sz w:val="24"/>
-          <w:szCs w:val="24"/>
-        </w:rPr>
-        <w:t xml:space="preserve">La pagina di login permette all’utente già registrato di effettuare l’accesso al proprio account personale. Vengono mostrati i campi per l’inserimento di e-mail (o nome utente) e della password. Se le credenziali coincidono a quelle presenti nel database, l’accesso viene correttamente completato, in caso contrario un messaggio di errore compare nella pagina. </w:t>
-      </w:r>
-    </w:p>
-    <w:p>
-      <w:pPr>
-        <w:spacing w:line="360" w:lineRule="auto"/>
-        <w:jc w:val="both"/>
-        <w:rPr>
-          <w:sz w:val="24"/>
-          <w:szCs w:val="24"/>
-        </w:rPr>
-      </w:pPr>
-      <w:r>
-        <w:rPr>
+        <w:t xml:space="preserve">utente) e della password. Se le credenziali coincidono a quelle presenti nel database, l’accesso viene correttamente completato, in caso contrario un messaggio di errore compare nella pagina. </w:t>
+      </w:r>
+    </w:p>
+    <w:p>
+      <w:pPr>
+        <w:spacing w:line="360" w:lineRule="auto"/>
+        <w:jc w:val="both"/>
+        <w:rPr>
+          <w:sz w:val="24"/>
+          <w:szCs w:val="24"/>
+        </w:rPr>
+      </w:pPr>
+      <w:r>
+        <w:rPr>
+          <w:noProof/>
           <w:sz w:val="24"/>
           <w:szCs w:val="24"/>
         </w:rPr>
@@ -6960,54 +6849,52 @@
         <w:spacing w:line="360" w:lineRule="auto"/>
         <w:jc w:val="both"/>
         <w:rPr>
-          <w:sz w:val="24"/>
-          <w:szCs w:val="24"/>
-        </w:rPr>
-      </w:pPr>
-    </w:p>
-    <w:p>
-      <w:pPr>
-        <w:spacing w:line="360" w:lineRule="auto"/>
-        <w:jc w:val="both"/>
-        <w:rPr>
           <w:rStyle w:val="Enfasigrassetto"/>
           <w:sz w:val="32"/>
           <w:szCs w:val="32"/>
         </w:rPr>
       </w:pPr>
-    </w:p>
-    <w:p>
-      <w:pPr>
-        <w:spacing w:line="360" w:lineRule="auto"/>
-        <w:jc w:val="both"/>
+      <w:r>
         <w:rPr>
           <w:rStyle w:val="Enfasigrassetto"/>
           <w:sz w:val="32"/>
           <w:szCs w:val="32"/>
         </w:rPr>
-      </w:pPr>
-    </w:p>
-    <w:p>
-      <w:pPr>
-        <w:spacing w:line="360" w:lineRule="auto"/>
-        <w:jc w:val="both"/>
+        <w:t>8.</w:t>
+      </w:r>
+      <w:r>
         <w:rPr>
           <w:rStyle w:val="Enfasigrassetto"/>
           <w:sz w:val="32"/>
           <w:szCs w:val="32"/>
         </w:rPr>
-      </w:pPr>
-    </w:p>
-    <w:p>
-      <w:pPr>
-        <w:spacing w:line="360" w:lineRule="auto"/>
-        <w:jc w:val="both"/>
+        <w:t>4</w:t>
+      </w:r>
+      <w:r>
         <w:rPr>
           <w:rStyle w:val="Enfasigrassetto"/>
           <w:sz w:val="32"/>
           <w:szCs w:val="32"/>
         </w:rPr>
-      </w:pPr>
+        <w:t xml:space="preserve"> Impostazioni dell’account (settings)</w:t>
+      </w:r>
+    </w:p>
+    <w:p>
+      <w:pPr>
+        <w:spacing w:after="360" w:line="360" w:lineRule="auto"/>
+        <w:jc w:val="both"/>
+        <w:rPr>
+          <w:sz w:val="24"/>
+          <w:szCs w:val="24"/>
+        </w:rPr>
+      </w:pPr>
+      <w:r>
+        <w:rPr>
+          <w:sz w:val="24"/>
+          <w:szCs w:val="24"/>
+        </w:rPr>
+        <w:t>All’interno della sezione dedicata alle impostazioni, l’utente personalizzare il profilo aggiungendo o modificando l’immagine di profilo, il nome e cognome e la nazionalità. Questi campi sono facoltativi e possono essere lasciati vuoti. Nel caso in cui non venga selezionata nessuna immagine di profilo, verrà utilizzata una immagine predefinita.</w:t>
+      </w:r>
     </w:p>
     <w:p>
       <w:pPr>
@@ -7015,89 +6902,19 @@
         <w:jc w:val="both"/>
         <w:rPr>
           <w:rStyle w:val="Enfasigrassetto"/>
-          <w:sz w:val="32"/>
-          <w:szCs w:val="32"/>
-        </w:rPr>
-      </w:pPr>
-    </w:p>
-    <w:p>
-      <w:pPr>
-        <w:spacing w:line="360" w:lineRule="auto"/>
-        <w:jc w:val="both"/>
-        <w:rPr>
-          <w:rStyle w:val="Enfasigrassetto"/>
-          <w:sz w:val="32"/>
-          <w:szCs w:val="32"/>
-        </w:rPr>
-      </w:pPr>
-    </w:p>
-    <w:p>
-      <w:pPr>
-        <w:spacing w:line="360" w:lineRule="auto"/>
-        <w:jc w:val="both"/>
-        <w:rPr>
-          <w:rStyle w:val="Enfasigrassetto"/>
-          <w:sz w:val="32"/>
-          <w:szCs w:val="32"/>
-        </w:rPr>
-      </w:pPr>
-      <w:r>
-        <w:rPr>
-          <w:rStyle w:val="Enfasigrassetto"/>
-          <w:sz w:val="32"/>
-          <w:szCs w:val="32"/>
+          <w:b w:val="0"/>
+          <w:bCs w:val="0"/>
+          <w:sz w:val="24"/>
+          <w:szCs w:val="24"/>
+        </w:rPr>
+      </w:pPr>
+      <w:r>
+        <w:rPr>
+          <w:noProof/>
+          <w:sz w:val="24"/>
+          <w:szCs w:val="24"/>
         </w:rPr>
         <w:lastRenderedPageBreak/>
-        <w:t>8.</w:t>
-      </w:r>
-      <w:r>
-        <w:rPr>
-          <w:rStyle w:val="Enfasigrassetto"/>
-          <w:sz w:val="32"/>
-          <w:szCs w:val="32"/>
-        </w:rPr>
-        <w:t>4</w:t>
-      </w:r>
-      <w:r>
-        <w:rPr>
-          <w:rStyle w:val="Enfasigrassetto"/>
-          <w:sz w:val="32"/>
-          <w:szCs w:val="32"/>
-        </w:rPr>
-        <w:t xml:space="preserve"> Impostazioni dell’account (settings)</w:t>
-      </w:r>
-    </w:p>
-    <w:p>
-      <w:pPr>
-        <w:spacing w:after="360" w:line="360" w:lineRule="auto"/>
-        <w:jc w:val="both"/>
-        <w:rPr>
-          <w:sz w:val="24"/>
-          <w:szCs w:val="24"/>
-        </w:rPr>
-      </w:pPr>
-      <w:r>
-        <w:rPr>
-          <w:sz w:val="24"/>
-          <w:szCs w:val="24"/>
-        </w:rPr>
-        <w:t>All’interno della sezione dedicata alle impostazioni, l’utente personalizzare il profilo aggiungendo o modificando l’immagine di profilo, il nome e cognome e la nazionalità. Questi campi sono facoltativi e possono essere lasciati vuoti. Nel caso in cui non venga selezionata nessuna immagine di profilo, verrà utilizzata una immagine predefinita.</w:t>
-      </w:r>
-    </w:p>
-    <w:p>
-      <w:pPr>
-        <w:spacing w:line="360" w:lineRule="auto"/>
-        <w:jc w:val="both"/>
-        <w:rPr>
-          <w:sz w:val="24"/>
-          <w:szCs w:val="24"/>
-        </w:rPr>
-      </w:pPr>
-      <w:r>
-        <w:rPr>
-          <w:sz w:val="24"/>
-          <w:szCs w:val="24"/>
-        </w:rPr>
         <w:drawing>
           <wp:inline distT="0" distB="0" distL="0" distR="0" wp14:anchorId="2D82A2BB" wp14:editId="3A5F767B">
             <wp:extent cx="5400040" cy="4340860"/>
@@ -7140,62 +6957,42 @@
         <w:spacing w:line="360" w:lineRule="auto"/>
         <w:jc w:val="both"/>
         <w:rPr>
-          <w:sz w:val="24"/>
-          <w:szCs w:val="24"/>
-        </w:rPr>
-      </w:pPr>
-    </w:p>
-    <w:p>
-      <w:pPr>
-        <w:spacing w:line="360" w:lineRule="auto"/>
-        <w:jc w:val="both"/>
-        <w:rPr>
           <w:rStyle w:val="Enfasigrassetto"/>
           <w:sz w:val="32"/>
           <w:szCs w:val="32"/>
         </w:rPr>
       </w:pPr>
-    </w:p>
-    <w:p>
-      <w:pPr>
-        <w:spacing w:line="360" w:lineRule="auto"/>
-        <w:jc w:val="both"/>
+      <w:r>
         <w:rPr>
           <w:rStyle w:val="Enfasigrassetto"/>
           <w:sz w:val="32"/>
           <w:szCs w:val="32"/>
         </w:rPr>
-      </w:pPr>
-    </w:p>
-    <w:p>
-      <w:pPr>
-        <w:spacing w:line="360" w:lineRule="auto"/>
-        <w:jc w:val="both"/>
+        <w:t>8.</w:t>
+      </w:r>
+      <w:r>
         <w:rPr>
           <w:rStyle w:val="Enfasigrassetto"/>
           <w:sz w:val="32"/>
           <w:szCs w:val="32"/>
         </w:rPr>
-      </w:pPr>
-    </w:p>
-    <w:p>
-      <w:pPr>
-        <w:spacing w:line="360" w:lineRule="auto"/>
-        <w:jc w:val="both"/>
+        <w:t>5</w:t>
+      </w:r>
+      <w:r>
         <w:rPr>
           <w:rStyle w:val="Enfasigrassetto"/>
           <w:sz w:val="32"/>
           <w:szCs w:val="32"/>
         </w:rPr>
-      </w:pPr>
+        <w:t xml:space="preserve"> </w:t>
+      </w:r>
       <w:r>
         <w:rPr>
           <w:rStyle w:val="Enfasigrassetto"/>
           <w:sz w:val="32"/>
           <w:szCs w:val="32"/>
         </w:rPr>
-        <w:lastRenderedPageBreak/>
-        <w:t>8.</w:t>
+        <w:t>Seguiti</w:t>
       </w:r>
       <w:r>
         <w:rPr>
@@ -7203,23 +7000,25 @@
           <w:sz w:val="32"/>
           <w:szCs w:val="32"/>
         </w:rPr>
-        <w:t>5</w:t>
-      </w:r>
+        <w:t xml:space="preserve"> (</w:t>
+      </w:r>
+      <w:proofErr w:type="spellStart"/>
       <w:r>
         <w:rPr>
           <w:rStyle w:val="Enfasigrassetto"/>
           <w:sz w:val="32"/>
           <w:szCs w:val="32"/>
         </w:rPr>
-        <w:t xml:space="preserve"> </w:t>
-      </w:r>
+        <w:t>perTe</w:t>
+      </w:r>
+      <w:proofErr w:type="spellEnd"/>
       <w:r>
         <w:rPr>
           <w:rStyle w:val="Enfasigrassetto"/>
           <w:sz w:val="32"/>
           <w:szCs w:val="32"/>
         </w:rPr>
-        <w:t>Seguiti</w:t>
+        <w:t>)</w:t>
       </w:r>
     </w:p>
     <w:p>
@@ -7316,18 +7115,84 @@
           <w:sz w:val="24"/>
           <w:szCs w:val="24"/>
         </w:rPr>
-        <w:t>La pagina del profilo ha lo scopo di mostrare le informazioni e i contenuti dell’utente in modo ordinato e chiaro. Nella parte superiore a sinistra sono presenti l’immagine del profilo e il nome utente, a destra invece sono mostrate le statistiche: il numero di post, il conteggio di follower e di seguiti. Nel resto della pagina si trova la griglia che espone tutti i post dell’utente in ordine dal più nuovo a quello vecchio.</w:t>
-      </w:r>
-    </w:p>
-    <w:p>
-      <w:pPr>
-        <w:spacing w:line="360" w:lineRule="auto"/>
-        <w:jc w:val="both"/>
-        <w:rPr>
-          <w:sz w:val="24"/>
-          <w:szCs w:val="24"/>
-        </w:rPr>
-      </w:pPr>
+        <w:t xml:space="preserve">La pagina del profilo ha lo scopo di mostrare le informazioni e i contenuti dell’utente in modo ordinato e chiaro. Nella parte superiore a sinistra sono presenti l’immagine del profilo e il nome utente, a destra invece sono mostrate le statistiche: il numero </w:t>
+      </w:r>
+      <w:r>
+        <w:rPr>
+          <w:sz w:val="24"/>
+          <w:szCs w:val="24"/>
+        </w:rPr>
+        <w:lastRenderedPageBreak/>
+        <w:t>di post, il conteggio di follower e di seguiti. Nel resto della pagina si trova la griglia che espone tutti i post dell’utente in ordine dal più nuovo a quello vecchio.</w:t>
+      </w:r>
+    </w:p>
+    <w:p>
+      <w:pPr>
+        <w:spacing w:line="360" w:lineRule="auto"/>
+        <w:jc w:val="both"/>
+        <w:rPr>
+          <w:b/>
+          <w:bCs/>
+          <w:sz w:val="32"/>
+          <w:szCs w:val="32"/>
+        </w:rPr>
+      </w:pPr>
+      <w:r>
+        <w:rPr>
+          <w:b/>
+          <w:bCs/>
+          <w:sz w:val="32"/>
+          <w:szCs w:val="32"/>
+        </w:rPr>
+        <w:drawing>
+          <wp:inline distT="0" distB="0" distL="0" distR="0" wp14:anchorId="1CCE2F48" wp14:editId="755C22F3">
+            <wp:extent cx="5400040" cy="3037840"/>
+            <wp:effectExtent l="0" t="0" r="0" b="0"/>
+            <wp:docPr id="1353714091" name="Immagine 2" descr="Immagine che contiene testo, schermata, software, Icona del computer&#10;&#10;Il contenuto generato dall'IA potrebbe non essere corretto."/>
+            <wp:cNvGraphicFramePr>
+              <a:graphicFrameLocks xmlns:a="http://schemas.openxmlformats.org/drawingml/2006/main" noChangeAspect="1"/>
+            </wp:cNvGraphicFramePr>
+            <a:graphic xmlns:a="http://schemas.openxmlformats.org/drawingml/2006/main">
+              <a:graphicData uri="http://schemas.openxmlformats.org/drawingml/2006/picture">
+                <pic:pic xmlns:pic="http://schemas.openxmlformats.org/drawingml/2006/picture">
+                  <pic:nvPicPr>
+                    <pic:cNvPr id="1353714091" name="Immagine 2" descr="Immagine che contiene testo, schermata, software, Icona del computer&#10;&#10;Il contenuto generato dall'IA potrebbe non essere corretto."/>
+                    <pic:cNvPicPr>
+                      <a:picLocks noChangeAspect="1" noChangeArrowheads="1"/>
+                    </pic:cNvPicPr>
+                  </pic:nvPicPr>
+                  <pic:blipFill>
+                    <a:blip r:embed="rId14" cstate="print">
+                      <a:extLst>
+                        <a:ext uri="{28A0092B-C50C-407E-A947-70E740481C1C}">
+                          <a14:useLocalDpi xmlns:a14="http://schemas.microsoft.com/office/drawing/2010/main" val="0"/>
+                        </a:ext>
+                      </a:extLst>
+                    </a:blip>
+                    <a:srcRect/>
+                    <a:stretch>
+                      <a:fillRect/>
+                    </a:stretch>
+                  </pic:blipFill>
+                  <pic:spPr bwMode="auto">
+                    <a:xfrm>
+                      <a:off x="0" y="0"/>
+                      <a:ext cx="5400040" cy="3037840"/>
+                    </a:xfrm>
+                    <a:prstGeom prst="rect">
+                      <a:avLst/>
+                    </a:prstGeom>
+                    <a:noFill/>
+                    <a:ln>
+                      <a:noFill/>
+                    </a:ln>
+                  </pic:spPr>
+                </pic:pic>
+              </a:graphicData>
+            </a:graphic>
+          </wp:inline>
+        </w:drawing>
+      </w:r>
     </w:p>
     <w:p>
       <w:pPr>
@@ -7350,190 +7215,114 @@
           <w:szCs w:val="32"/>
         </w:rPr>
       </w:pPr>
-    </w:p>
-    <w:p>
-      <w:pPr>
-        <w:spacing w:line="360" w:lineRule="auto"/>
-        <w:jc w:val="both"/>
+      <w:r>
         <w:rPr>
           <w:rStyle w:val="Enfasigrassetto"/>
           <w:sz w:val="32"/>
           <w:szCs w:val="32"/>
         </w:rPr>
-      </w:pPr>
-    </w:p>
-    <w:p>
-      <w:pPr>
-        <w:spacing w:line="360" w:lineRule="auto"/>
-        <w:jc w:val="both"/>
+        <w:t>8.</w:t>
+      </w:r>
+      <w:r>
         <w:rPr>
           <w:rStyle w:val="Enfasigrassetto"/>
           <w:sz w:val="32"/>
           <w:szCs w:val="32"/>
         </w:rPr>
-      </w:pPr>
-    </w:p>
-    <w:p>
-      <w:pPr>
-        <w:spacing w:line="360" w:lineRule="auto"/>
-        <w:jc w:val="both"/>
+        <w:t>7</w:t>
+      </w:r>
+      <w:r>
         <w:rPr>
           <w:rStyle w:val="Enfasigrassetto"/>
           <w:sz w:val="32"/>
           <w:szCs w:val="32"/>
         </w:rPr>
-      </w:pPr>
-    </w:p>
-    <w:p>
-      <w:pPr>
-        <w:spacing w:line="360" w:lineRule="auto"/>
-        <w:jc w:val="both"/>
+        <w:t xml:space="preserve"> Pagine di creazione e modifica del post (create e </w:t>
+      </w:r>
+      <w:proofErr w:type="spellStart"/>
+      <w:r>
         <w:rPr>
           <w:rStyle w:val="Enfasigrassetto"/>
           <w:sz w:val="32"/>
           <w:szCs w:val="32"/>
         </w:rPr>
-      </w:pPr>
-    </w:p>
-    <w:p>
-      <w:pPr>
-        <w:spacing w:line="360" w:lineRule="auto"/>
-        <w:jc w:val="both"/>
+        <w:t>edit</w:t>
+      </w:r>
+      <w:proofErr w:type="spellEnd"/>
+      <w:r>
         <w:rPr>
           <w:rStyle w:val="Enfasigrassetto"/>
           <w:sz w:val="32"/>
           <w:szCs w:val="32"/>
         </w:rPr>
-      </w:pPr>
-    </w:p>
-    <w:p>
-      <w:pPr>
-        <w:spacing w:line="360" w:lineRule="auto"/>
-        <w:jc w:val="both"/>
-        <w:rPr>
-          <w:rStyle w:val="Enfasigrassetto"/>
-          <w:sz w:val="32"/>
-          <w:szCs w:val="32"/>
-        </w:rPr>
-      </w:pPr>
-    </w:p>
-    <w:p>
-      <w:pPr>
-        <w:spacing w:line="360" w:lineRule="auto"/>
-        <w:jc w:val="both"/>
-        <w:rPr>
-          <w:rStyle w:val="Enfasigrassetto"/>
-          <w:sz w:val="32"/>
-          <w:szCs w:val="32"/>
-        </w:rPr>
-      </w:pPr>
-      <w:r>
-        <w:rPr>
-          <w:rStyle w:val="Enfasigrassetto"/>
-          <w:sz w:val="32"/>
-          <w:szCs w:val="32"/>
+        <w:t>)</w:t>
+      </w:r>
+    </w:p>
+    <w:p>
+      <w:pPr>
+        <w:spacing w:after="360" w:line="360" w:lineRule="auto"/>
+        <w:jc w:val="both"/>
+        <w:rPr>
+          <w:sz w:val="24"/>
+          <w:szCs w:val="24"/>
+        </w:rPr>
+      </w:pPr>
+      <w:r>
+        <w:rPr>
+          <w:sz w:val="24"/>
+          <w:szCs w:val="24"/>
+        </w:rPr>
+        <w:t xml:space="preserve">La sezione dedicata alla creazione e modifica del post consentono all’utente di creare e pubblicare o aggiornare la propria carta in modo semplice. È possibile caricare due immagini: una per il fronte e una per il retro in modo da mostrare l’oggetto in modo chiaro. L’utente può inserire un titolo (con lunghezza massima di ottanta caratteri) una descrizione (massimo trecento caratteri) per fornire informazioni della carta e scegliere una condizione, da </w:t>
+      </w:r>
+      <w:proofErr w:type="spellStart"/>
+      <w:r>
+        <w:rPr>
+          <w:sz w:val="24"/>
+          <w:szCs w:val="24"/>
+        </w:rPr>
+        <w:t>mint</w:t>
+      </w:r>
+      <w:proofErr w:type="spellEnd"/>
+      <w:r>
+        <w:rPr>
+          <w:sz w:val="24"/>
+          <w:szCs w:val="24"/>
+        </w:rPr>
+        <w:t xml:space="preserve"> (perfetta) a </w:t>
+      </w:r>
+      <w:proofErr w:type="spellStart"/>
+      <w:r>
+        <w:rPr>
+          <w:sz w:val="24"/>
+          <w:szCs w:val="24"/>
+        </w:rPr>
+        <w:t>poor</w:t>
+      </w:r>
+      <w:proofErr w:type="spellEnd"/>
+      <w:r>
+        <w:rPr>
+          <w:sz w:val="24"/>
+          <w:szCs w:val="24"/>
+        </w:rPr>
+        <w:t xml:space="preserve"> (scadente). Infine, l’utente ha la possibilità di inserire facoltativamente un link esterno alla pagina del marketplace dove la carta è disponibile all’acquisto.</w:t>
+      </w:r>
+    </w:p>
+    <w:p>
+      <w:pPr>
+        <w:spacing w:line="360" w:lineRule="auto"/>
+        <w:jc w:val="both"/>
+        <w:rPr>
+          <w:sz w:val="24"/>
+          <w:szCs w:val="24"/>
+        </w:rPr>
+      </w:pPr>
+      <w:r>
+        <w:rPr>
+          <w:noProof/>
+          <w:sz w:val="24"/>
+          <w:szCs w:val="24"/>
         </w:rPr>
         <w:lastRenderedPageBreak/>
-        <w:t>8.</w:t>
-      </w:r>
-      <w:r>
-        <w:rPr>
-          <w:rStyle w:val="Enfasigrassetto"/>
-          <w:sz w:val="32"/>
-          <w:szCs w:val="32"/>
-        </w:rPr>
-        <w:t>7</w:t>
-      </w:r>
-      <w:r>
-        <w:rPr>
-          <w:rStyle w:val="Enfasigrassetto"/>
-          <w:sz w:val="32"/>
-          <w:szCs w:val="32"/>
-        </w:rPr>
-        <w:t xml:space="preserve"> Pagine di creazione e modifica del post (create e </w:t>
-      </w:r>
-      <w:proofErr w:type="spellStart"/>
-      <w:r>
-        <w:rPr>
-          <w:rStyle w:val="Enfasigrassetto"/>
-          <w:sz w:val="32"/>
-          <w:szCs w:val="32"/>
-        </w:rPr>
-        <w:t>edit</w:t>
-      </w:r>
-      <w:proofErr w:type="spellEnd"/>
-      <w:r>
-        <w:rPr>
-          <w:rStyle w:val="Enfasigrassetto"/>
-          <w:sz w:val="32"/>
-          <w:szCs w:val="32"/>
-        </w:rPr>
-        <w:t>)</w:t>
-      </w:r>
-    </w:p>
-    <w:p>
-      <w:pPr>
-        <w:spacing w:after="360" w:line="360" w:lineRule="auto"/>
-        <w:jc w:val="both"/>
-        <w:rPr>
-          <w:sz w:val="24"/>
-          <w:szCs w:val="24"/>
-        </w:rPr>
-      </w:pPr>
-      <w:r>
-        <w:rPr>
-          <w:sz w:val="24"/>
-          <w:szCs w:val="24"/>
-        </w:rPr>
-        <w:t xml:space="preserve">La sezione dedicata alla creazione e modifica del post consentono all’utente di creare e pubblicare o aggiornare la propria carta in modo semplice. È possibile caricare due immagini: una per il fronte e una per il retro in modo da mostrare l’oggetto in modo chiaro. L’utente può inserire un titolo (con lunghezza massima di ottanta caratteri) una descrizione (massimo trecento caratteri) per fornire informazioni della carta e scegliere una condizione, da </w:t>
-      </w:r>
-      <w:proofErr w:type="spellStart"/>
-      <w:r>
-        <w:rPr>
-          <w:sz w:val="24"/>
-          <w:szCs w:val="24"/>
-        </w:rPr>
-        <w:t>mint</w:t>
-      </w:r>
-      <w:proofErr w:type="spellEnd"/>
-      <w:r>
-        <w:rPr>
-          <w:sz w:val="24"/>
-          <w:szCs w:val="24"/>
-        </w:rPr>
-        <w:t xml:space="preserve"> (perfetta) a </w:t>
-      </w:r>
-      <w:proofErr w:type="spellStart"/>
-      <w:r>
-        <w:rPr>
-          <w:sz w:val="24"/>
-          <w:szCs w:val="24"/>
-        </w:rPr>
-        <w:t>poor</w:t>
-      </w:r>
-      <w:proofErr w:type="spellEnd"/>
-      <w:r>
-        <w:rPr>
-          <w:sz w:val="24"/>
-          <w:szCs w:val="24"/>
-        </w:rPr>
-        <w:t xml:space="preserve"> (scadente). Infine, l’utente ha la possibilità di inserire facoltativamente un link esterno alla pagina del marketplace dove la carta è disponibile all’acquisto.</w:t>
-      </w:r>
-    </w:p>
-    <w:p>
-      <w:pPr>
-        <w:spacing w:line="360" w:lineRule="auto"/>
-        <w:jc w:val="both"/>
-        <w:rPr>
-          <w:sz w:val="24"/>
-          <w:szCs w:val="24"/>
-        </w:rPr>
-      </w:pPr>
-      <w:r>
-        <w:rPr>
-          <w:sz w:val="24"/>
-          <w:szCs w:val="24"/>
-        </w:rPr>
         <w:drawing>
           <wp:inline distT="0" distB="0" distL="0" distR="0" wp14:anchorId="65330B27" wp14:editId="58753B82">
             <wp:extent cx="5400040" cy="4923790"/>
@@ -7550,7 +7339,7 @@
                     <pic:cNvPicPr/>
                   </pic:nvPicPr>
                   <pic:blipFill>
-                    <a:blip r:embed="rId14"/>
+                    <a:blip r:embed="rId15"/>
                     <a:stretch>
                       <a:fillRect/>
                     </a:stretch>
@@ -7652,7 +7441,7 @@
       </w:pPr>
     </w:p>
     <w:sectPr>
-      <w:footerReference w:type="default" r:id="rId15"/>
+      <w:footerReference w:type="default" r:id="rId16"/>
       <w:pgSz w:w="11906" w:h="16838"/>
       <w:pgMar w:top="1701" w:right="1701" w:bottom="1701" w:left="1701" w:header="0" w:footer="567" w:gutter="0"/>
       <w:cols w:space="708"/>
@@ -10177,7 +9966,6 @@
   <w:style w:type="character" w:default="1" w:styleId="Carpredefinitoparagrafo">
     <w:name w:val="Default Paragraph Font"/>
     <w:uiPriority w:val="1"/>
-    <w:semiHidden/>
     <w:unhideWhenUsed/>
   </w:style>
   <w:style w:type="table" w:default="1" w:styleId="Tabellanormale">

</xml_diff>